<commit_message>
Cleanup some lecture materials
</commit_message>
<xml_diff>
--- a/SOFTWARE ENGINEERING/Course Project Materials/D4.ConstructionAndTesting.docx
+++ b/SOFTWARE ENGINEERING/Course Project Materials/D4.ConstructionAndTesting.docx
@@ -287,7 +287,31 @@
         <w:rPr>
           <w:b w:val="0"/>
         </w:rPr>
-        <w:t xml:space="preserve"> prerecorded video for section </w:t>
+        <w:t xml:space="preserve"> prerecorded video </w:t>
+      </w:r>
+      <w:r>
+        <w:rPr>
+          <w:b w:val="0"/>
+        </w:rPr>
+        <w:t>by</w:t>
+      </w:r>
+      <w:r>
+        <w:rPr>
+          <w:b w:val="0"/>
+        </w:rPr>
+        <w:t xml:space="preserve"> upload</w:t>
+      </w:r>
+      <w:r>
+        <w:rPr>
+          <w:b w:val="0"/>
+        </w:rPr>
+        <w:t>ing</w:t>
+      </w:r>
+      <w:r>
+        <w:rPr>
+          <w:b w:val="0"/>
+        </w:rPr>
+        <w:t xml:space="preserve"> your video as an unlisted YouTube video and include the URL in section </w:t>
       </w:r>
       <w:r>
         <w:rPr>
@@ -299,42 +323,6 @@
         <w:rPr>
           <w:b w:val="0"/>
         </w:rPr>
-        <w:t xml:space="preserve"> as a separate file in the submission on </w:t>
-      </w:r>
-      <w:r>
-        <w:rPr>
-          <w:b w:val="0"/>
-        </w:rPr>
-        <w:t>Gradescope</w:t>
-      </w:r>
-      <w:r>
-        <w:rPr>
-          <w:b w:val="0"/>
-        </w:rPr>
-        <w:t xml:space="preserve">. Alternatively, you can upload your video on as an unlisted YouTube video and include the URL in section </w:t>
-      </w:r>
-      <w:r>
-        <w:rPr>
-          <w:b w:val="0"/>
-        </w:rPr>
-        <w:t>3</w:t>
-      </w:r>
-      <w:r>
-        <w:rPr>
-          <w:b w:val="0"/>
-        </w:rPr>
-        <w:t xml:space="preserve">. In either case, please specify how you submitted your video in Section </w:t>
-      </w:r>
-      <w:r>
-        <w:rPr>
-          <w:b w:val="0"/>
-        </w:rPr>
-        <w:t>3</w:t>
-      </w:r>
-      <w:r>
-        <w:rPr>
-          <w:b w:val="0"/>
-        </w:rPr>
         <w:t xml:space="preserve">. </w:t>
       </w:r>
     </w:p>
@@ -371,30 +359,6 @@
         </w:rPr>
         <w:t xml:space="preserve"> marks</w:t>
       </w:r>
-    </w:p>
-    <w:p>
-      <w:pPr>
-        <w:ind w:left="-5"/>
-        <w:rPr>
-          <w:bCs/>
-          <w:u w:val="single"/>
-        </w:rPr>
-      </w:pPr>
-      <w:r>
-        <w:rPr>
-          <w:bCs/>
-          <w:u w:val="single"/>
-        </w:rPr>
-        <w:t>Please note that this deliverable includes a bonus component worth 10 marks</w:t>
-      </w:r>
-    </w:p>
-    <w:p>
-      <w:pPr>
-        <w:ind w:left="-5"/>
-        <w:rPr>
-          <w:bCs/>
-        </w:rPr>
-      </w:pPr>
     </w:p>
     <w:p>
       <w:pPr>
@@ -450,7 +414,19 @@
         <w:rPr>
           <w:color w:val="C55A11"/>
         </w:rPr>
-        <w:t xml:space="preserve"> marks)</w:t>
+        <w:t xml:space="preserve"> </w:t>
+      </w:r>
+      <w:r>
+        <w:rPr>
+          <w:color w:val="C55A11"/>
+        </w:rPr>
+        <w:t>points</w:t>
+      </w:r>
+      <w:r>
+        <w:rPr>
+          <w:color w:val="C55A11"/>
+        </w:rPr>
+        <w:t>)</w:t>
       </w:r>
     </w:p>
     <w:p>
@@ -550,7 +526,19 @@
         <w:rPr>
           <w:u w:val="none" w:color="000000"/>
         </w:rPr>
-        <w:t>5 marks)</w:t>
+        <w:t xml:space="preserve">5 </w:t>
+      </w:r>
+      <w:r>
+        <w:rPr>
+          <w:u w:val="none" w:color="000000"/>
+        </w:rPr>
+        <w:t>points</w:t>
+      </w:r>
+      <w:r>
+        <w:rPr>
+          <w:u w:val="none" w:color="000000"/>
+        </w:rPr>
+        <w:t>)</w:t>
       </w:r>
     </w:p>
     <w:p>
@@ -709,19 +697,25 @@
         <w:rPr>
           <w:u w:val="none"/>
         </w:rPr>
-        <w:t>4</w:t>
+        <w:t>35</w:t>
       </w:r>
       <w:r>
         <w:rPr>
           <w:u w:val="none"/>
         </w:rPr>
-        <w:t>0</w:t>
+        <w:t xml:space="preserve"> </w:t>
       </w:r>
       <w:r>
         <w:rPr>
           <w:u w:val="none"/>
         </w:rPr>
-        <w:t xml:space="preserve"> marks)</w:t>
+        <w:t>points</w:t>
+      </w:r>
+      <w:r>
+        <w:rPr>
+          <w:u w:val="none"/>
+        </w:rPr>
+        <w:t>)</w:t>
       </w:r>
     </w:p>
     <w:p>
@@ -786,7 +780,7 @@
           <w:color w:val="000000" w:themeColor="text1"/>
           <w:u w:color="000000"/>
         </w:rPr>
-        <w:t xml:space="preserve"> then demo how a user would experience the selected use cases (e.g., if this is a hospital admin app, how would </w:t>
+        <w:t xml:space="preserve"> then demo how a user would experience the selected use cases (e.g., if this is a hospital admin app, how would a doctor check a patient record and </w:t>
       </w:r>
       <w:r>
         <w:rPr>
@@ -795,8 +789,7 @@
           <w:color w:val="000000" w:themeColor="text1"/>
           <w:u w:color="000000"/>
         </w:rPr>
-        <w:lastRenderedPageBreak/>
-        <w:t xml:space="preserve">a doctor check a patient record and </w:t>
+        <w:t>prescribe</w:t>
       </w:r>
       <w:r>
         <w:rPr>
@@ -805,7 +798,7 @@
           <w:color w:val="000000" w:themeColor="text1"/>
           <w:u w:color="000000"/>
         </w:rPr>
-        <w:t>prescribe</w:t>
+        <w:t xml:space="preserve"> a medication to them using your app).</w:t>
       </w:r>
       <w:r>
         <w:rPr>
@@ -814,15 +807,6 @@
           <w:color w:val="000000" w:themeColor="text1"/>
           <w:u w:color="000000"/>
         </w:rPr>
-        <w:t xml:space="preserve"> a medication to them using your app).</w:t>
-      </w:r>
-      <w:r>
-        <w:rPr>
-          <w:b w:val="0"/>
-          <w:bCs/>
-          <w:color w:val="000000" w:themeColor="text1"/>
-          <w:u w:color="000000"/>
-        </w:rPr>
         <w:t xml:space="preserve"> You are free to narrate what is happening using your voice or text descriptions on the screen.</w:t>
       </w:r>
     </w:p>
@@ -832,6 +816,7 @@
         <w:ind w:left="-5"/>
       </w:pPr>
       <w:r>
+        <w:lastRenderedPageBreak/>
         <w:t xml:space="preserve">Section </w:t>
       </w:r>
       <w:r>
@@ -862,19 +847,25 @@
         <w:rPr>
           <w:u w:val="none" w:color="000000"/>
         </w:rPr>
-        <w:t>5</w:t>
+        <w:t>45</w:t>
       </w:r>
       <w:r>
         <w:rPr>
           <w:u w:val="none" w:color="000000"/>
         </w:rPr>
-        <w:t>0</w:t>
+        <w:t xml:space="preserve"> </w:t>
       </w:r>
       <w:r>
         <w:rPr>
           <w:u w:val="none" w:color="000000"/>
         </w:rPr>
-        <w:t xml:space="preserve"> marks)</w:t>
+        <w:t>points</w:t>
+      </w:r>
+      <w:r>
+        <w:rPr>
+          <w:u w:val="none" w:color="000000"/>
+        </w:rPr>
+        <w:t>)</w:t>
       </w:r>
     </w:p>
     <w:p>
@@ -1339,7 +1330,19 @@
         <w:rPr>
           <w:u w:val="none" w:color="000000"/>
         </w:rPr>
-        <w:t>2 marks)</w:t>
+        <w:t xml:space="preserve">2 </w:t>
+      </w:r>
+      <w:r>
+        <w:rPr>
+          <w:u w:val="none" w:color="000000"/>
+        </w:rPr>
+        <w:t>points</w:t>
+      </w:r>
+      <w:r>
+        <w:rPr>
+          <w:u w:val="none" w:color="000000"/>
+        </w:rPr>
+        <w:t>)</w:t>
       </w:r>
     </w:p>
     <w:p>
@@ -1406,43 +1409,25 @@
         <w:rPr>
           <w:color w:val="BF4E14" w:themeColor="accent2" w:themeShade="BF"/>
         </w:rPr>
-        <w:t>**</w:t>
+        <w:t xml:space="preserve">SECTION </w:t>
       </w:r>
       <w:r>
         <w:rPr>
           <w:color w:val="BF4E14" w:themeColor="accent2" w:themeShade="BF"/>
         </w:rPr>
-        <w:t xml:space="preserve">SECTION </w:t>
+        <w:t>6</w:t>
       </w:r>
       <w:r>
         <w:rPr>
           <w:color w:val="BF4E14" w:themeColor="accent2" w:themeShade="BF"/>
         </w:rPr>
-        <w:t>6</w:t>
+        <w:t xml:space="preserve">: Unit Testing (10 </w:t>
       </w:r>
       <w:r>
         <w:rPr>
           <w:color w:val="BF4E14" w:themeColor="accent2" w:themeShade="BF"/>
         </w:rPr>
-        <w:t xml:space="preserve">: (BONUS): Unit Testing (10 </w:t>
-      </w:r>
-      <w:r>
-        <w:rPr>
-          <w:color w:val="BF4E14" w:themeColor="accent2" w:themeShade="BF"/>
-        </w:rPr>
         <w:t>points)</w:t>
-      </w:r>
-      <w:r>
-        <w:rPr>
-          <w:color w:val="BF4E14" w:themeColor="accent2" w:themeShade="BF"/>
-        </w:rPr>
-        <w:t xml:space="preserve"> *</w:t>
-      </w:r>
-      <w:r>
-        <w:rPr>
-          <w:color w:val="BF4E14" w:themeColor="accent2" w:themeShade="BF"/>
-        </w:rPr>
-        <w:t>*</w:t>
       </w:r>
     </w:p>
     <w:p>
@@ -1880,7 +1865,7 @@
         <w:kern w:val="2"/>
         <w:sz w:val="24"/>
         <w:szCs w:val="24"/>
-        <w:lang w:eastAsia="en-US" w:bidi="ar-SA"/>
+        <w:lang w:val="en-US" w:eastAsia="en-US" w:bidi="ar-SA"/>
         <w14:ligatures w14:val="standardContextual"/>
       </w:rPr>
     </w:rPrDefault>

</xml_diff>